<commit_message>
Remove temporary document file from Modul_10
</commit_message>
<xml_diff>
--- a/Modul_10/LaprakBP2_Project_Muhammad_Rizal_Nurfirdaus.docx
+++ b/Modul_10/LaprakBP2_Project_Muhammad_Rizal_Nurfirdaus.docx
@@ -862,7 +862,7 @@
           <w:szCs w:val="22"/>
         </w:rPr>
       </w:pPr>
-      <w:bookmarkStart w:id="1" w:name="_Toc202068738"/>
+      <w:bookmarkStart w:id="1" w:name="_Toc202098544"/>
       <w:r>
         <w:rPr>
           <w:sz w:val="22"/>
@@ -936,7 +936,7 @@
         </w:rPr>
         <w:fldChar w:fldCharType="separate"/>
       </w:r>
-      <w:hyperlink w:anchor="_Toc202068738" w:history="1">
+      <w:hyperlink w:anchor="_Toc202098544" w:history="1">
         <w:r>
           <w:rPr>
             <w:rStyle w:val="Hyperlink"/>
@@ -963,7 +963,7 @@
             <w:noProof/>
             <w:webHidden/>
           </w:rPr>
-          <w:instrText xml:space="preserve"> PAGEREF _Toc202068738 \h </w:instrText>
+          <w:instrText xml:space="preserve"> PAGEREF _Toc202098544 \h </w:instrText>
         </w:r>
         <w:r>
           <w:rPr>
@@ -1007,7 +1007,7 @@
           <w:szCs w:val="24"/>
         </w:rPr>
       </w:pPr>
-      <w:hyperlink w:anchor="_Toc202068739" w:history="1">
+      <w:hyperlink w:anchor="_Toc202098545" w:history="1">
         <w:r>
           <w:rPr>
             <w:rStyle w:val="Hyperlink"/>
@@ -1034,7 +1034,7 @@
             <w:noProof/>
             <w:webHidden/>
           </w:rPr>
-          <w:instrText xml:space="preserve"> PAGEREF _Toc202068739 \h </w:instrText>
+          <w:instrText xml:space="preserve"> PAGEREF _Toc202098545 \h </w:instrText>
         </w:r>
         <w:r>
           <w:rPr>
@@ -1078,7 +1078,7 @@
           <w:szCs w:val="24"/>
         </w:rPr>
       </w:pPr>
-      <w:hyperlink w:anchor="_Toc202068740" w:history="1">
+      <w:hyperlink w:anchor="_Toc202098546" w:history="1">
         <w:r>
           <w:rPr>
             <w:rStyle w:val="Hyperlink"/>
@@ -1105,7 +1105,7 @@
             <w:noProof/>
             <w:webHidden/>
           </w:rPr>
-          <w:instrText xml:space="preserve"> PAGEREF _Toc202068740 \h </w:instrText>
+          <w:instrText xml:space="preserve"> PAGEREF _Toc202098546 \h </w:instrText>
         </w:r>
         <w:r>
           <w:rPr>
@@ -1150,7 +1150,7 @@
           <w:szCs w:val="24"/>
         </w:rPr>
       </w:pPr>
-      <w:hyperlink w:anchor="_Toc202068741" w:history="1">
+      <w:hyperlink w:anchor="_Toc202098547" w:history="1">
         <w:r>
           <w:rPr>
             <w:rStyle w:val="Hyperlink"/>
@@ -1195,7 +1195,7 @@
             <w:noProof/>
             <w:webHidden/>
           </w:rPr>
-          <w:instrText xml:space="preserve"> PAGEREF _Toc202068741 \h </w:instrText>
+          <w:instrText xml:space="preserve"> PAGEREF _Toc202098547 \h </w:instrText>
         </w:r>
         <w:r>
           <w:rPr>
@@ -1240,7 +1240,7 @@
           <w:szCs w:val="24"/>
         </w:rPr>
       </w:pPr>
-      <w:hyperlink w:anchor="_Toc202068742" w:history="1">
+      <w:hyperlink w:anchor="_Toc202098548" w:history="1">
         <w:r>
           <w:rPr>
             <w:rStyle w:val="Hyperlink"/>
@@ -1295,7 +1295,7 @@
             <w:noProof/>
             <w:webHidden/>
           </w:rPr>
-          <w:instrText xml:space="preserve"> PAGEREF _Toc202068742 \h </w:instrText>
+          <w:instrText xml:space="preserve"> PAGEREF _Toc202098548 \h </w:instrText>
         </w:r>
         <w:r>
           <w:rPr>
@@ -1340,7 +1340,7 @@
           <w:szCs w:val="24"/>
         </w:rPr>
       </w:pPr>
-      <w:hyperlink w:anchor="_Toc202068743" w:history="1">
+      <w:hyperlink w:anchor="_Toc202098549" w:history="1">
         <w:r>
           <w:rPr>
             <w:rStyle w:val="Hyperlink"/>
@@ -1383,7 +1383,7 @@
             <w:noProof/>
             <w:webHidden/>
           </w:rPr>
-          <w:instrText xml:space="preserve"> PAGEREF _Toc202068743 \h </w:instrText>
+          <w:instrText xml:space="preserve"> PAGEREF _Toc202098549 \h </w:instrText>
         </w:r>
         <w:r>
           <w:rPr>
@@ -1427,7 +1427,7 @@
           <w:szCs w:val="24"/>
         </w:rPr>
       </w:pPr>
-      <w:hyperlink w:anchor="_Toc202068744" w:history="1">
+      <w:hyperlink w:anchor="_Toc202098550" w:history="1">
         <w:r>
           <w:rPr>
             <w:rStyle w:val="Hyperlink"/>
@@ -1454,7 +1454,7 @@
             <w:noProof/>
             <w:webHidden/>
           </w:rPr>
-          <w:instrText xml:space="preserve"> PAGEREF _Toc202068744 \h </w:instrText>
+          <w:instrText xml:space="preserve"> PAGEREF _Toc202098550 \h </w:instrText>
         </w:r>
         <w:r>
           <w:rPr>
@@ -1498,7 +1498,7 @@
           <w:szCs w:val="24"/>
         </w:rPr>
       </w:pPr>
-      <w:hyperlink w:anchor="_Toc202068745" w:history="1">
+      <w:hyperlink w:anchor="_Toc202098551" w:history="1">
         <w:r>
           <w:rPr>
             <w:rStyle w:val="Hyperlink"/>
@@ -1525,7 +1525,7 @@
             <w:noProof/>
             <w:webHidden/>
           </w:rPr>
-          <w:instrText xml:space="preserve"> PAGEREF _Toc202068745 \h </w:instrText>
+          <w:instrText xml:space="preserve"> PAGEREF _Toc202098551 \h </w:instrText>
         </w:r>
         <w:r>
           <w:rPr>
@@ -1600,7 +1600,7 @@
       <w:pPr>
         <w:pStyle w:val="Judul1"/>
       </w:pPr>
-      <w:bookmarkStart w:id="2" w:name="_Toc202068739"/>
+      <w:bookmarkStart w:id="2" w:name="_Toc202098545"/>
       <w:r>
         <w:t>BAB I</w:t>
       </w:r>
@@ -1610,7 +1610,7 @@
       <w:pPr>
         <w:pStyle w:val="Judul1"/>
       </w:pPr>
-      <w:bookmarkStart w:id="3" w:name="_Toc202068740"/>
+      <w:bookmarkStart w:id="3" w:name="_Toc202098546"/>
       <w:r>
         <w:t>Project</w:t>
       </w:r>
@@ -1628,7 +1628,7 @@
           <w:lang w:val="id-ID"/>
         </w:rPr>
       </w:pPr>
-      <w:bookmarkStart w:id="4" w:name="_Toc202068741"/>
+      <w:bookmarkStart w:id="4" w:name="_Toc202098547"/>
       <w:r>
         <w:rPr>
           <w:lang w:val="id-ID"/>
@@ -1663,7 +1663,7 @@
           <w:lang w:val="id-ID"/>
         </w:rPr>
       </w:pPr>
-      <w:bookmarkStart w:id="5" w:name="_Toc202068742"/>
+      <w:bookmarkStart w:id="5" w:name="_Toc202098548"/>
       <w:r>
         <w:rPr>
           <w:lang w:val="id-ID"/>
@@ -1850,7 +1850,7 @@
           <w:lang w:val="en-US"/>
         </w:rPr>
       </w:pPr>
-      <w:bookmarkStart w:id="6" w:name="_Toc202068743"/>
+      <w:bookmarkStart w:id="6" w:name="_Toc202098549"/>
       <w:proofErr w:type="spellStart"/>
       <w:r>
         <w:rPr>
@@ -4786,7 +4786,7 @@
       <w:pPr>
         <w:pStyle w:val="Judul1"/>
       </w:pPr>
-      <w:bookmarkStart w:id="7" w:name="_Toc202068744"/>
+      <w:bookmarkStart w:id="7" w:name="_Toc202098550"/>
       <w:r>
         <w:lastRenderedPageBreak/>
         <w:t xml:space="preserve">BAB </w:t>
@@ -4800,7 +4800,7 @@
       <w:pPr>
         <w:pStyle w:val="Judul1"/>
       </w:pPr>
-      <w:bookmarkStart w:id="8" w:name="_Toc202068745"/>
+      <w:bookmarkStart w:id="8" w:name="_Toc202098551"/>
       <w:r>
         <w:t>KESIMPULAN</w:t>
       </w:r>

</xml_diff>